<commit_message>
chore(docs): regenerate spec snapshot through v1.3.3 + supporting docs
Adds Thina_CRM_System_Specification_v1.3.3.docx; bumps generate-spec.mjs VERSION to 1.3.4 with version-history rows for v1.3.1/1.3.2/1.3.3. Refreshes related marketing/training/demo docs and logo binaries from latest scripts. Adds c:/dev/thina-crm/.vscode/excel-pq-symbols path to powerquery client config.
</commit_message>
<xml_diff>
--- a/docs/Marketing Documents/Thina_CRM_Brand_Kit.docx
+++ b/docs/Marketing Documents/Thina_CRM_Brand_Kit.docx
@@ -3002,4 +3002,10 @@
     </w:rPr>
   </w:style>
 </w:styles>
+</file>
+
+<file path=docMetadata/LabelInfo.xml><?xml version="1.0" encoding="utf-8"?>
+<clbl:labelList xmlns:clbl="http://schemas.microsoft.com/office/2020/mipLabelMetadata">
+  <clbl:label id="{f42aa342-8706-4288-bd11-ebb85995028c}" enabled="1" method="Privileged" siteId="{72f988bf-86f1-41af-91ab-2d7cd011db47}" contentBits="0" removed="0"/>
+</clbl:labelList>
 </file>
</xml_diff>